<commit_message>
Save current optimization, status, and audit updates
</commit_message>
<xml_diff>
--- a/output/doc/ajna-erc4626-cre-master-qna.docx
+++ b/output/doc/ajna-erc4626-cre-master-qna.docx
@@ -14,13 +14,12 @@
           <w:color w:val="0F0F0F"/>
           <w:sz w:val="40"/>
         </w:rPr>
-        <w:t>Ajna ERC-4626 + CRE Master Q&amp;A (Merged)</w:t>
-      </w:r>
-    </w:p>
-    <w:p>
-      <w:pPr/>
-      <w:r>
-        <w:t>This document merges the original numbered question set (Q1-Q85) with direct answers in one place.</w:t>
+        <w:t>Ajna ERC-4626 Vaults + Chainlink CRE: Adversarial Audit Q&amp;A Compendium</w:t>
+      </w:r>
+    </w:p>
+    <w:p>
+      <w:r>
+        <w:t>An implementation-aware reference covering all 85 adversarial audit questions with direct answers across architecture, accounting integrity, liquidity risk, keeper operations, CRE design, and stress scenarios.</w:t>
       </w:r>
     </w:p>
     <w:p>
@@ -28,11 +27,99 @@
         <w:pStyle w:val="Heading1"/>
       </w:pPr>
       <w:r>
+        <w:t>Table of Contents</w:t>
+      </w:r>
+    </w:p>
+    <w:p>
+      <w:pPr>
+        <w:pStyle w:val="ListBullet"/>
+      </w:pPr>
+      <w:r>
         <w:t>A. Architecture and Capital Flow</w:t>
       </w:r>
     </w:p>
     <w:p>
       <w:pPr>
+        <w:pStyle w:val="ListBullet"/>
+      </w:pPr>
+      <w:r>
+        <w:t>B. ERC-4626 Accounting and Share Integrity</w:t>
+      </w:r>
+    </w:p>
+    <w:p>
+      <w:pPr>
+        <w:pStyle w:val="ListBullet"/>
+      </w:pPr>
+      <w:r>
+        <w:t>C. Buffer Design and Exit Liquidity</w:t>
+      </w:r>
+    </w:p>
+    <w:p>
+      <w:pPr>
+        <w:pStyle w:val="ListBullet"/>
+      </w:pPr>
+      <w:r>
+        <w:t>D. Ajna-Specific Economic and Market Structure Risk</w:t>
+      </w:r>
+    </w:p>
+    <w:p>
+      <w:pPr>
+        <w:pStyle w:val="ListBullet"/>
+      </w:pPr>
+      <w:r>
+        <w:t>E. Keeper Correctness and Operational Risk</w:t>
+      </w:r>
+    </w:p>
+    <w:p>
+      <w:pPr>
+        <w:pStyle w:val="ListBullet"/>
+      </w:pPr>
+      <w:r>
+        <w:t>F. Oracle / Price Source / Data Dependency Risk</w:t>
+      </w:r>
+    </w:p>
+    <w:p>
+      <w:pPr>
+        <w:pStyle w:val="ListBullet"/>
+      </w:pPr>
+      <w:r>
+        <w:t>G. Smart Contract Safety</w:t>
+      </w:r>
+    </w:p>
+    <w:p>
+      <w:pPr>
+        <w:pStyle w:val="ListBullet"/>
+      </w:pPr>
+      <w:r>
+        <w:t>H. Adversarial Scenarios</w:t>
+      </w:r>
+    </w:p>
+    <w:p>
+      <w:pPr>
+        <w:pStyle w:val="ListBullet"/>
+      </w:pPr>
+      <w:r>
+        <w:t>I. CRE-Specific Design Review</w:t>
+      </w:r>
+    </w:p>
+    <w:p>
+      <w:pPr>
+        <w:pStyle w:val="ListBullet"/>
+      </w:pPr>
+      <w:r>
+        <w:t>J. Stress Tests</w:t>
+      </w:r>
+    </w:p>
+    <w:p>
+      <w:pPr>
+        <w:pStyle w:val="Heading1"/>
+      </w:pPr>
+      <w:r>
+        <w:t>A. Architecture and Capital Flow</w:t>
+      </w:r>
+    </w:p>
+    <w:p>
+      <w:pPr>
         <w:pStyle w:val="Heading2"/>
       </w:pPr>
       <w:r>
@@ -88,15 +175,6 @@
       </w:r>
     </w:p>
     <w:p>
-      <w:pPr>
-        <w:pStyle w:val="AnswerLabel"/>
-      </w:pPr>
-      <w:r>
-        <w:t>Answer</w:t>
-      </w:r>
-    </w:p>
-    <w:p>
-      <w:pPr/>
       <w:r>
         <w:t>Deposit/mint run through `Vault.deposit`/`Vault.mint` -&gt; `_deposit` -&gt; `BUFFER.addQuoteToken` and LP accounting updates; withdraw/redeem run through `Vault.withdraw`/`Vault.redeem` -&gt; `_withdraw` -&gt; `BUFFER.removeQuoteToken`; rebalancing uses `move`, `moveToBuffer`, and `moveFromBuffer`; emergency flow is `pause` or `recoverCollateral` followed by `returnQuoteToken`.</w:t>
       </w:r>
@@ -150,15 +228,6 @@
       </w:r>
     </w:p>
     <w:p>
-      <w:pPr>
-        <w:pStyle w:val="AnswerLabel"/>
-      </w:pPr>
-      <w:r>
-        <w:t>Answer</w:t>
-      </w:r>
-    </w:p>
-    <w:p>
-      <w:pPr/>
       <w:r>
         <w:t>At runtime, assets are split between user wallets (pre-deposit), vault-controlled balances, the Buffer reserve, and Ajna bucket LP exposure. The Buffer is the immediate redemption source; Ajna bucket value is indirect and may require rebalancing to become withdrawable.</w:t>
       </w:r>
@@ -172,15 +241,6 @@
       </w:r>
     </w:p>
     <w:p>
-      <w:pPr>
-        <w:pStyle w:val="AnswerLabel"/>
-      </w:pPr>
-      <w:r>
-        <w:t>Answer</w:t>
-      </w:r>
-    </w:p>
-    <w:p>
-      <w:pPr/>
       <w:r>
         <w:t>Onchain: Vault/Buffer/Auth/library state transitions and Ajna pool interactions. Offchain: keeper policy timing, oracle/subgraph reads, CRE scheduling/orchestration, queue execution, and bridge-triggered writes.</w:t>
       </w:r>
@@ -194,15 +254,6 @@
       </w:r>
     </w:p>
     <w:p>
-      <w:pPr>
-        <w:pStyle w:val="AnswerLabel"/>
-      </w:pPr>
-      <w:r>
-        <w:t>Answer</w:t>
-      </w:r>
-    </w:p>
-    <w:p>
-      <w:pPr/>
       <w:r>
         <w:t>Safety-critical for exits are Buffer solvency (`BUFFER.total`), keeper liveness and correctness, Ajna unwindability under market stress, and integrity of privileged role/key custody.</w:t>
       </w:r>
@@ -216,15 +267,6 @@
       </w:r>
     </w:p>
     <w:p>
-      <w:pPr>
-        <w:pStyle w:val="AnswerLabel"/>
-      </w:pPr>
-      <w:r>
-        <w:t>Answer</w:t>
-      </w:r>
-    </w:p>
-    <w:p>
-      <w:pPr/>
       <w:r>
         <w:t>The design is non-custodial in ownership terms, but user exit safety depends on operator-like liveness because withdrawals are buffer-only and refill is operationally managed.</w:t>
       </w:r>
@@ -262,15 +304,6 @@
       </w:r>
     </w:p>
     <w:p>
-      <w:pPr>
-        <w:pStyle w:val="AnswerLabel"/>
-      </w:pPr>
-      <w:r>
-        <w:t>Answer</w:t>
-      </w:r>
-    </w:p>
-    <w:p>
-      <w:pPr/>
       <w:r>
         <w:t>`totalAssets()` sums Buffer value + removed-collateral accounting + Ajna bucket LP-derived value, then converts WAD to asset decimals. It is accounting value, not guaranteed immediate realizable exit value, and can overstate practical liquidity in lock/bad-debt/auction stress.</w:t>
       </w:r>
@@ -300,15 +333,6 @@
       </w:r>
     </w:p>
     <w:p>
-      <w:pPr>
-        <w:pStyle w:val="AnswerLabel"/>
-      </w:pPr>
-      <w:r>
-        <w:t>Answer</w:t>
-      </w:r>
-    </w:p>
-    <w:p>
-      <w:pPr/>
       <w:r>
         <w:t>Preview and fee paths are mostly coherent, with `_decimalsOffset()` correctly overridden for non-18 decimal assets. Main residual fairness risk is timing/liquidity-state asymmetry rather than a classic first-depositor inflation exploit.</w:t>
       </w:r>
@@ -354,15 +378,6 @@
       </w:r>
     </w:p>
     <w:p>
-      <w:pPr>
-        <w:pStyle w:val="AnswerLabel"/>
-      </w:pPr>
-      <w:r>
-        <w:t>Answer</w:t>
-      </w:r>
-    </w:p>
-    <w:p>
-      <w:pPr/>
       <w:r>
         <w:t>Yes. There is a structural mismatch between assets counted in `totalAssets`, assets liquid now (Buffer), assets liquid after keeper action, and assets exposed to Ajna insolvency/lock states.</w:t>
       </w:r>
@@ -416,15 +431,6 @@
       </w:r>
     </w:p>
     <w:p>
-      <w:pPr>
-        <w:pStyle w:val="AnswerLabel"/>
-      </w:pPr>
-      <w:r>
-        <w:t>Answer</w:t>
-      </w:r>
-    </w:p>
-    <w:p>
-      <w:pPr/>
       <w:r>
         <w:t>Yes. Low buffer, stale positions, bucket drift, interest accrual between reads/actions, and delayed rebalancing can produce economically unfair realized outcomes versus quoted accounting value.</w:t>
       </w:r>
@@ -470,15 +476,6 @@
       </w:r>
     </w:p>
     <w:p>
-      <w:pPr>
-        <w:pStyle w:val="AnswerLabel"/>
-      </w:pPr>
-      <w:r>
-        <w:t>Answer</w:t>
-      </w:r>
-    </w:p>
-    <w:p>
-      <w:pPr/>
       <w:r>
         <w:t>Yes. Buffer-only withdrawal creates first-exit advantage and late-exit reverts in stress, which is a material economic/safety issue, not just UX friction.</w:t>
       </w:r>
@@ -500,15 +497,6 @@
       </w:r>
     </w:p>
     <w:p>
-      <w:pPr>
-        <w:pStyle w:val="AnswerLabel"/>
-      </w:pPr>
-      <w:r>
-        <w:t>Answer</w:t>
-      </w:r>
-    </w:p>
-    <w:p>
-      <w:pPr/>
       <w:r>
         <w:t>Not inherently. A static configured buffer ratio is not stress-adaptive and may be insufficient under fast coordinated redemptions.</w:t>
       </w:r>
@@ -522,15 +510,6 @@
       </w:r>
     </w:p>
     <w:p>
-      <w:pPr>
-        <w:pStyle w:val="AnswerLabel"/>
-      </w:pPr>
-      <w:r>
-        <w:t>Answer</w:t>
-      </w:r>
-    </w:p>
-    <w:p>
-      <w:pPr/>
       <w:r>
         <w:t>If redemptions exceed current buffer before refill, `maxWithdraw`/`maxRedeem` collapse to available Buffer value and later withdrawals/redeems revert.</w:t>
       </w:r>
@@ -544,15 +523,6 @@
       </w:r>
     </w:p>
     <w:p>
-      <w:pPr>
-        <w:pStyle w:val="AnswerLabel"/>
-      </w:pPr>
-      <w:r>
-        <w:t>Answer</w:t>
-      </w:r>
-    </w:p>
-    <w:p>
-      <w:pPr/>
       <w:r>
         <w:t>Yes, this structure can produce bank-run dynamics where early exits are honored and later exits are blocked pending rebalance.</w:t>
       </w:r>
@@ -566,15 +536,6 @@
       </w:r>
     </w:p>
     <w:p>
-      <w:pPr>
-        <w:pStyle w:val="AnswerLabel"/>
-      </w:pPr>
-      <w:r>
-        <w:t>Answer</w:t>
-      </w:r>
-    </w:p>
-    <w:p>
-      <w:pPr/>
       <w:r>
         <w:t>It is material economic and safety risk because users are forced into timing-dependent liquidity access during adverse conditions.</w:t>
       </w:r>
@@ -588,15 +549,6 @@
       </w:r>
     </w:p>
     <w:p>
-      <w:pPr>
-        <w:pStyle w:val="AnswerLabel"/>
-      </w:pPr>
-      <w:r>
-        <w:t>Answer</w:t>
-      </w:r>
-    </w:p>
-    <w:p>
-      <w:pPr/>
       <w:r>
         <w:t>Yes. An attacker can intentionally pressure/pin the buffer via large redemption timing, liquidity-state manipulation, or keeper-window gaming.</w:t>
       </w:r>
@@ -610,15 +562,6 @@
       </w:r>
     </w:p>
     <w:p>
-      <w:pPr>
-        <w:pStyle w:val="AnswerLabel"/>
-      </w:pPr>
-      <w:r>
-        <w:t>Answer</w:t>
-      </w:r>
-    </w:p>
-    <w:p>
-      <w:pPr/>
       <w:r>
         <w:t>Yes. Buffer accounting can drift from practical economic value via stale state, interest timing, non-standard token behavior assumptions, and operational lag.</w:t>
       </w:r>
@@ -640,15 +583,6 @@
       </w:r>
     </w:p>
     <w:p>
-      <w:pPr>
-        <w:pStyle w:val="AnswerLabel"/>
-      </w:pPr>
-      <w:r>
-        <w:t>Answer</w:t>
-      </w:r>
-    </w:p>
-    <w:p>
-      <w:pPr/>
       <w:r>
         <w:t>Ajna bucket placement strongly impacts realized yield and risk; apparent accounting performance can diverge from executable risk-adjusted outcomes.</w:t>
       </w:r>
@@ -710,15 +644,6 @@
       </w:r>
     </w:p>
     <w:p>
-      <w:pPr>
-        <w:pStyle w:val="AnswerLabel"/>
-      </w:pPr>
-      <w:r>
-        <w:t>Answer</w:t>
-      </w:r>
-    </w:p>
-    <w:p>
-      <w:pPr/>
       <w:r>
         <w:t>The strategy assumes LUP/HTP boundaries remain useful safety anchors, bankruptcy/auction/debt-lock checks are timely, and range validity reflects safe earning zones.</w:t>
       </w:r>
@@ -732,15 +657,6 @@
       </w:r>
     </w:p>
     <w:p>
-      <w:pPr>
-        <w:pStyle w:val="AnswerLabel"/>
-      </w:pPr>
-      <w:r>
-        <w:t>Answer</w:t>
-      </w:r>
-    </w:p>
-    <w:p>
-      <w:pPr/>
       <w:r>
         <w:t>Only partially. Under fast price moves, toxic flow, and stressed collateral, these assumptions can fail between keeper cycles.</w:t>
       </w:r>
@@ -754,15 +670,6 @@
       </w:r>
     </w:p>
     <w:p>
-      <w:pPr>
-        <w:pStyle w:val="AnswerLabel"/>
-      </w:pPr>
-      <w:r>
-        <w:t>Answer</w:t>
-      </w:r>
-    </w:p>
-    <w:p>
-      <w:pPr/>
       <w:r>
         <w:t>Yes. As passive liquidity, the vault is exposed to adverse selection by informed borrowers during stressed or one-sided market regimes.</w:t>
       </w:r>
@@ -776,15 +683,6 @@
       </w:r>
     </w:p>
     <w:p>
-      <w:pPr>
-        <w:pStyle w:val="AnswerLabel"/>
-      </w:pPr>
-      <w:r>
-        <w:t>Answer</w:t>
-      </w:r>
-    </w:p>
-    <w:p>
-      <w:pPr/>
       <w:r>
         <w:t>Yes. Deterministic optimal-bucket targeting can concentrate liquidity in the wrong place at the wrong time.</w:t>
       </w:r>
@@ -798,15 +696,6 @@
       </w:r>
     </w:p>
     <w:p>
-      <w:pPr>
-        <w:pStyle w:val="AnswerLabel"/>
-      </w:pPr>
-      <w:r>
-        <w:t>Answer</w:t>
-      </w:r>
-    </w:p>
-    <w:p>
-      <w:pPr/>
       <w:r>
         <w:t>Yes. With stale or biased price inputs, the strategy can chase apparent yield into fragile or hard-to-exit buckets.</w:t>
       </w:r>
@@ -820,15 +709,6 @@
       </w:r>
     </w:p>
     <w:p>
-      <w:pPr>
-        <w:pStyle w:val="AnswerLabel"/>
-      </w:pPr>
-      <w:r>
-        <w:t>Answer</w:t>
-      </w:r>
-    </w:p>
-    <w:p>
-      <w:pPr/>
       <w:r>
         <w:t>Yes. Liquidity can appear productive in accounting while practically trapped for near-term user exits.</w:t>
       </w:r>
@@ -850,15 +730,6 @@
       </w:r>
     </w:p>
     <w:p>
-      <w:pPr>
-        <w:pStyle w:val="AnswerLabel"/>
-      </w:pPr>
-      <w:r>
-        <w:t>Answer</w:t>
-      </w:r>
-    </w:p>
-    <w:p>
-      <w:pPr/>
       <w:r>
         <w:t>The keeper decides whether to abort, drain, rebalance between buckets, top up buffer, or deploy excess buffer, based on pause/health/range/dust/bankruptcy/debt-lock checks and target calculations.</w:t>
       </w:r>
@@ -872,15 +743,6 @@
       </w:r>
     </w:p>
     <w:p>
-      <w:pPr>
-        <w:pStyle w:val="AnswerLabel"/>
-      </w:pPr>
-      <w:r>
-        <w:t>Answer</w:t>
-      </w:r>
-    </w:p>
-    <w:p>
-      <w:pPr/>
       <w:r>
         <w:t>Safety-critical configs include cadence, bucket offset, buffer padding, min move amount, bankruptcy and auction windows, subgraph fail behavior, oracle mode/staleness, fixed price, and `HALT_KEEPER_IF_LUP_BELOW_HTP`.</w:t>
       </w:r>
@@ -894,15 +756,6 @@
       </w:r>
     </w:p>
     <w:p>
-      <w:pPr>
-        <w:pStyle w:val="AnswerLabel"/>
-      </w:pPr>
-      <w:r>
-        <w:t>Answer</w:t>
-      </w:r>
-    </w:p>
-    <w:p>
-      <w:pPr/>
       <w:r>
         <w:t>Trusted inputs are RPC state, subgraph responses, oracle outputs (CoinGecko/Chronicle/fixed), environment configuration, and the keeper signing key.</w:t>
       </w:r>
@@ -980,15 +833,6 @@
       </w:r>
     </w:p>
     <w:p>
-      <w:pPr>
-        <w:pStyle w:val="AnswerLabel"/>
-      </w:pPr>
-      <w:r>
-        <w:t>Answer</w:t>
-      </w:r>
-    </w:p>
-    <w:p>
-      <w:pPr/>
       <w:r>
         <w:t>Offline keeper stops rebalancing; subgraph failure can fail-open or fail-closed by config; stale/wrong oracle can mis-target or abort; fixed-price misconfig causes deterministic bad policy; bad debt/auctions can abort runs; gas estimation can fall back; `LUPBelowHTP` can hard-halt keeper.</w:t>
       </w:r>
@@ -1002,15 +846,6 @@
       </w:r>
     </w:p>
     <w:p>
-      <w:pPr>
-        <w:pStyle w:val="AnswerLabel"/>
-      </w:pPr>
-      <w:r>
-        <w:t>Answer</w:t>
-      </w:r>
-    </w:p>
-    <w:p>
-      <w:pPr/>
       <w:r>
         <w:t>Yes. The keeper has explicit safe-stop paths (pause, bad debt, out-of-range, dusty, bankruptcy/debt-lock, and optional LUPBelowHTP halt).</w:t>
       </w:r>
@@ -1024,15 +859,6 @@
       </w:r>
     </w:p>
     <w:p>
-      <w:pPr>
-        <w:pStyle w:val="AnswerLabel"/>
-      </w:pPr>
-      <w:r>
-        <w:t>Answer</w:t>
-      </w:r>
-    </w:p>
-    <w:p>
-      <w:pPr/>
       <w:r>
         <w:t>Yes. It can continue in economically poor modes when inputs are valid-looking but wrong (e.g., fixed misprice, accepted stale data, fail-open health dependency).</w:t>
       </w:r>
@@ -1046,15 +872,6 @@
       </w:r>
     </w:p>
     <w:p>
-      <w:pPr>
-        <w:pStyle w:val="AnswerLabel"/>
-      </w:pPr>
-      <w:r>
-        <w:t>Answer</w:t>
-      </w:r>
-    </w:p>
-    <w:p>
-      <w:pPr/>
       <w:r>
         <w:t>Yes. Keeper delays alone can cause meaningful user harm through redemption liveness failure and adverse realized timing.</w:t>
       </w:r>
@@ -1068,15 +885,6 @@
       </w:r>
     </w:p>
     <w:p>
-      <w:pPr>
-        <w:pStyle w:val="AnswerLabel"/>
-      </w:pPr>
-      <w:r>
-        <w:t>Answer</w:t>
-      </w:r>
-    </w:p>
-    <w:p>
-      <w:pPr/>
       <w:r>
         <w:t>Yes. A 12-hour cadence introduces substantial latency risk during volatile conditions.</w:t>
       </w:r>
@@ -1090,15 +898,6 @@
       </w:r>
     </w:p>
     <w:p>
-      <w:pPr>
-        <w:pStyle w:val="AnswerLabel"/>
-      </w:pPr>
-      <w:r>
-        <w:t>Answer</w:t>
-      </w:r>
-    </w:p>
-    <w:p>
-      <w:pPr/>
       <w:r>
         <w:t>Yes. Deterministic target logic plus known cadence creates exploitable path dependency.</w:t>
       </w:r>
@@ -1112,15 +911,6 @@
       </w:r>
     </w:p>
     <w:p>
-      <w:pPr>
-        <w:pStyle w:val="AnswerLabel"/>
-      </w:pPr>
-      <w:r>
-        <w:t>Answer</w:t>
-      </w:r>
-    </w:p>
-    <w:p>
-      <w:pPr/>
       <w:r>
         <w:t>Yes. Conditions can be manipulated around run timing to induce poor rebalances or aborts.</w:t>
       </w:r>
@@ -1134,15 +924,6 @@
       </w:r>
     </w:p>
     <w:p>
-      <w:pPr>
-        <w:pStyle w:val="AnswerLabel"/>
-      </w:pPr>
-      <w:r>
-        <w:t>Answer</w:t>
-      </w:r>
-    </w:p>
-    <w:p>
-      <w:pPr/>
       <w:r>
         <w:t>Yes. Read-decide-write race windows exist between observed state and transaction inclusion.</w:t>
       </w:r>
@@ -1164,15 +945,6 @@
       </w:r>
     </w:p>
     <w:p>
-      <w:pPr>
-        <w:pStyle w:val="AnswerLabel"/>
-      </w:pPr>
-      <w:r>
-        <w:t>Answer</w:t>
-      </w:r>
-    </w:p>
-    <w:p>
-      <w:pPr/>
       <w:r>
         <w:t>Oracle dependence is reintroduced in offchain keeper bucket targeting (`getPrice` path), even if Ajna core is oracle-less.</w:t>
       </w:r>
@@ -1218,15 +990,6 @@
       </w:r>
     </w:p>
     <w:p>
-      <w:pPr>
-        <w:pStyle w:val="AnswerLabel"/>
-      </w:pPr>
-      <w:r>
-        <w:t>Answer</w:t>
-      </w:r>
-    </w:p>
-    <w:p>
-      <w:pPr/>
       <w:r>
         <w:t>CoinGecko path has API centralization/outage risk; Chronicle path has stronger integrity but staleness/coverage caveats; fixed-price path has highest operator misconfiguration risk; CRE+Chainlink feed path is strongest if integrated as deterministic policy input.</w:t>
       </w:r>
@@ -1240,15 +1003,6 @@
       </w:r>
     </w:p>
     <w:p>
-      <w:pPr>
-        <w:pStyle w:val="AnswerLabel"/>
-      </w:pPr>
-      <w:r>
-        <w:t>Answer</w:t>
-      </w:r>
-    </w:p>
-    <w:p>
-      <w:pPr/>
       <w:r>
         <w:t>Safest target architecture is deterministic CRE policy with Chainlink-based reference feeds and strict freshness/deviation guards.</w:t>
       </w:r>
@@ -1262,15 +1016,6 @@
       </w:r>
     </w:p>
     <w:p>
-      <w:pPr>
-        <w:pStyle w:val="AnswerLabel"/>
-      </w:pPr>
-      <w:r>
-        <w:t>Answer</w:t>
-      </w:r>
-    </w:p>
-    <w:p>
-      <w:pPr/>
       <w:r>
         <w:t>The easiest path to misconfigure is fixed-price mode.</w:t>
       </w:r>
@@ -1284,15 +1029,6 @@
       </w:r>
     </w:p>
     <w:p>
-      <w:pPr>
-        <w:pStyle w:val="AnswerLabel"/>
-      </w:pPr>
-      <w:r>
-        <w:t>Answer</w:t>
-      </w:r>
-    </w:p>
-    <w:p>
-      <w:pPr/>
       <w:r>
         <w:t>Most robust to latency/outage/manipulation is CRE consensus workflowing plus high-integrity onchain feed ingestion used as primary policy input.</w:t>
       </w:r>
@@ -1306,15 +1042,6 @@
       </w:r>
     </w:p>
     <w:p>
-      <w:pPr>
-        <w:pStyle w:val="AnswerLabel"/>
-      </w:pPr>
-      <w:r>
-        <w:t>Answer</w:t>
-      </w:r>
-    </w:p>
-    <w:p>
-      <w:pPr/>
       <w:r>
         <w:t>Yes. Stale but plausible prices can systematically place liquidity into wrong buckets.</w:t>
       </w:r>
@@ -1328,15 +1055,6 @@
       </w:r>
     </w:p>
     <w:p>
-      <w:pPr>
-        <w:pStyle w:val="AnswerLabel"/>
-      </w:pPr>
-      <w:r>
-        <w:t>Answer</w:t>
-      </w:r>
-    </w:p>
-    <w:p>
-      <w:pPr/>
       <w:r>
         <w:t>Yes. Source disagreement/drift can create oscillation and repeated bad reallocations.</w:t>
       </w:r>
@@ -1350,15 +1068,6 @@
       </w:r>
     </w:p>
     <w:p>
-      <w:pPr>
-        <w:pStyle w:val="AnswerLabel"/>
-      </w:pPr>
-      <w:r>
-        <w:t>Answer</w:t>
-      </w:r>
-    </w:p>
-    <w:p>
-      <w:pPr/>
       <w:r>
         <w:t>Yes. A stale reference can move capital from relatively safe buckets into fragile ranges.</w:t>
       </w:r>
@@ -1380,15 +1089,6 @@
       </w:r>
     </w:p>
     <w:p>
-      <w:pPr>
-        <w:pStyle w:val="AnswerLabel"/>
-      </w:pPr>
-      <w:r>
-        <w:t>Answer</w:t>
-      </w:r>
-    </w:p>
-    <w:p>
-      <w:pPr/>
       <w:r>
         <w:t>Privileged roles are admin, keeper, and swapper with broad policy and operational influence.</w:t>
       </w:r>
@@ -1402,15 +1102,6 @@
       </w:r>
     </w:p>
     <w:p>
-      <w:pPr>
-        <w:pStyle w:val="AnswerLabel"/>
-      </w:pPr>
-      <w:r>
-        <w:t>Answer</w:t>
-      </w:r>
-    </w:p>
-    <w:p>
-      <w:pPr/>
       <w:r>
         <w:t>Yes. Admin/keeper/swapper permissions can directly or indirectly cause user loss via bad config, unsafe moves, or failed emergency handling.</w:t>
       </w:r>
@@ -1480,15 +1171,6 @@
       </w:r>
     </w:p>
     <w:p>
-      <w:pPr>
-        <w:pStyle w:val="AnswerLabel"/>
-      </w:pPr>
-      <w:r>
-        <w:t>Answer</w:t>
-      </w:r>
-    </w:p>
-    <w:p>
-      <w:pPr/>
       <w:r>
         <w:t>Pause/unpause, cap/fee/min-bucket changes are admin-controlled; move and buffer operations are role-gated; recovery paths are operator-mediated and can keep vault paused.</w:t>
       </w:r>
@@ -1502,15 +1184,6 @@
       </w:r>
     </w:p>
     <w:p>
-      <w:pPr>
-        <w:pStyle w:val="AnswerLabel"/>
-      </w:pPr>
-      <w:r>
-        <w:t>Answer</w:t>
-      </w:r>
-    </w:p>
-    <w:p>
-      <w:pPr/>
       <w:r>
         <w:t>Reentrancy guards exist; dominant residual risk is stale-state and partial economic correctness under asynchronous operation, not classic lock bypass.</w:t>
       </w:r>
@@ -1524,15 +1197,6 @@
       </w:r>
     </w:p>
     <w:p>
-      <w:pPr>
-        <w:pStyle w:val="AnswerLabel"/>
-      </w:pPr>
-      <w:r>
-        <w:t>Answer</w:t>
-      </w:r>
-    </w:p>
-    <w:p>
-      <w:pPr/>
       <w:r>
         <w:t>Yes. Helper-layer assumptions in buffer-ratio checks, conversions, and state freshness can fail under stressed timing and changing pool conditions.</w:t>
       </w:r>
@@ -1546,15 +1210,6 @@
       </w:r>
     </w:p>
     <w:p>
-      <w:pPr>
-        <w:pStyle w:val="AnswerLabel"/>
-      </w:pPr>
-      <w:r>
-        <w:t>Answer</w:t>
-      </w:r>
-    </w:p>
-    <w:p>
-      <w:pPr/>
       <w:r>
         <w:t>Yes. Contract logic uses valuation proxies that may not equal immediate executable liquidity during Ajna stress states.</w:t>
       </w:r>
@@ -1576,15 +1231,6 @@
       </w:r>
     </w:p>
     <w:p>
-      <w:pPr>
-        <w:pStyle w:val="AnswerLabel"/>
-      </w:pPr>
-      <w:r>
-        <w:t>Answer</w:t>
-      </w:r>
-    </w:p>
-    <w:p>
-      <w:pPr/>
       <w:r>
         <w:t>Share price manipulation is plausible via timing around stale accounting and liquidity asymmetry; impact is usually fairness distortion unless stress persists (severity: Medium).</w:t>
       </w:r>
@@ -1598,15 +1244,6 @@
       </w:r>
     </w:p>
     <w:p>
-      <w:pPr>
-        <w:pStyle w:val="AnswerLabel"/>
-      </w:pPr>
-      <w:r>
-        <w:t>Answer</w:t>
-      </w:r>
-    </w:p>
-    <w:p>
-      <w:pPr/>
       <w:r>
         <w:t>Donation/inflation attack surface is comparatively low in this design due to accounting mechanics, but invariants should remain tested (severity: Low).</w:t>
       </w:r>
@@ -1620,15 +1257,6 @@
       </w:r>
     </w:p>
     <w:p>
-      <w:pPr>
-        <w:pStyle w:val="AnswerLabel"/>
-      </w:pPr>
-      <w:r>
-        <w:t>Answer</w:t>
-      </w:r>
-    </w:p>
-    <w:p>
-      <w:pPr/>
       <w:r>
         <w:t>Sandwiching around deposit/redeem can worsen user execution fairness through keeper/state timing (severity: Medium).</w:t>
       </w:r>
@@ -1642,15 +1270,6 @@
       </w:r>
     </w:p>
     <w:p>
-      <w:pPr>
-        <w:pStyle w:val="AnswerLabel"/>
-      </w:pPr>
-      <w:r>
-        <w:t>Answer</w:t>
-      </w:r>
-    </w:p>
-    <w:p>
-      <w:pPr/>
       <w:r>
         <w:t>Strategic buffer exhaustion can force late-user redemption failures and strong first-exit advantage (severity: Critical).</w:t>
       </w:r>
@@ -1664,15 +1283,6 @@
       </w:r>
     </w:p>
     <w:p>
-      <w:pPr>
-        <w:pStyle w:val="AnswerLabel"/>
-      </w:pPr>
-      <w:r>
-        <w:t>Answer</w:t>
-      </w:r>
-    </w:p>
-    <w:p>
-      <w:pPr/>
       <w:r>
         <w:t>Keeper timing exploitation can induce repeated poor or skipped rebalances around predictable windows (severity: High).</w:t>
       </w:r>
@@ -1686,15 +1296,6 @@
       </w:r>
     </w:p>
     <w:p>
-      <w:pPr>
-        <w:pStyle w:val="AnswerLabel"/>
-      </w:pPr>
-      <w:r>
-        <w:t>Answer</w:t>
-      </w:r>
-    </w:p>
-    <w:p>
-      <w:pPr/>
       <w:r>
         <w:t>Stale oracle/reference data can drive wrong-bucket reallocations and realized yield loss (severity: High).</w:t>
       </w:r>
@@ -1708,15 +1309,6 @@
       </w:r>
     </w:p>
     <w:p>
-      <w:pPr>
-        <w:pStyle w:val="AnswerLabel"/>
-      </w:pPr>
-      <w:r>
-        <w:t>Answer</w:t>
-      </w:r>
-    </w:p>
-    <w:p>
-      <w:pPr/>
       <w:r>
         <w:t>Dust-state griefing can create skip-heavy behavior and operational drag (severity: Medium).</w:t>
       </w:r>
@@ -1730,15 +1322,6 @@
       </w:r>
     </w:p>
     <w:p>
-      <w:pPr>
-        <w:pStyle w:val="AnswerLabel"/>
-      </w:pPr>
-      <w:r>
-        <w:t>Answer</w:t>
-      </w:r>
-    </w:p>
-    <w:p>
-      <w:pPr/>
       <w:r>
         <w:t>Borrower-side toxic flow can extract value from passive liquidity placement (severity: High).</w:t>
       </w:r>
@@ -1752,15 +1335,6 @@
       </w:r>
     </w:p>
     <w:p>
-      <w:pPr>
-        <w:pStyle w:val="AnswerLabel"/>
-      </w:pPr>
-      <w:r>
-        <w:t>Answer</w:t>
-      </w:r>
-    </w:p>
-    <w:p>
-      <w:pPr/>
       <w:r>
         <w:t>Auction/bankruptcy states can trap liquidity and create severe liveness plus economic harm (severity: Critical).</w:t>
       </w:r>
@@ -1774,15 +1348,6 @@
       </w:r>
     </w:p>
     <w:p>
-      <w:pPr>
-        <w:pStyle w:val="AnswerLabel"/>
-      </w:pPr>
-      <w:r>
-        <w:t>Answer</w:t>
-      </w:r>
-    </w:p>
-    <w:p>
-      <w:pPr/>
       <w:r>
         <w:t>Operator key compromise in bridge model can trigger unauthorized writes and broad operational damage (severity: High).</w:t>
       </w:r>
@@ -1796,15 +1361,6 @@
       </w:r>
     </w:p>
     <w:p>
-      <w:pPr>
-        <w:pStyle w:val="AnswerLabel"/>
-      </w:pPr>
-      <w:r>
-        <w:t>Answer</w:t>
-      </w:r>
-    </w:p>
-    <w:p>
-      <w:pPr/>
       <w:r>
         <w:t>Misconfigured buffer ratio can either break exits (too low) or severely reduce strategy efficacy (too high) (severity: High).</w:t>
       </w:r>
@@ -1818,15 +1374,6 @@
       </w:r>
     </w:p>
     <w:p>
-      <w:pPr>
-        <w:pStyle w:val="AnswerLabel"/>
-      </w:pPr>
-      <w:r>
-        <w:t>Answer</w:t>
-      </w:r>
-    </w:p>
-    <w:p>
-      <w:pPr/>
       <w:r>
         <w:t>Misconfigured fixed price can produce systematic bad policy decisions and wrong rebalances (severity: High).</w:t>
       </w:r>
@@ -1840,15 +1387,6 @@
       </w:r>
     </w:p>
     <w:p>
-      <w:pPr>
-        <w:pStyle w:val="AnswerLabel"/>
-      </w:pPr>
-      <w:r>
-        <w:t>Answer</w:t>
-      </w:r>
-    </w:p>
-    <w:p>
-      <w:pPr/>
       <w:r>
         <w:t>CRE workflow bugs can repeat or skip actions, harming liveness and consistency if not caught by idempotency/invariants (severity: High).</w:t>
       </w:r>
@@ -1862,15 +1400,6 @@
       </w:r>
     </w:p>
     <w:p>
-      <w:pPr>
-        <w:pStyle w:val="AnswerLabel"/>
-      </w:pPr>
-      <w:r>
-        <w:t>Answer</w:t>
-      </w:r>
-    </w:p>
-    <w:p>
-      <w:pPr/>
       <w:r>
         <w:t>AI advisory misinfluence is a process risk; direct protocol risk is lower while AI remains non-authoritative (severity: Low).</w:t>
       </w:r>
@@ -1884,15 +1413,6 @@
       </w:r>
     </w:p>
     <w:p>
-      <w:pPr>
-        <w:pStyle w:val="AnswerLabel"/>
-      </w:pPr>
-      <w:r>
-        <w:t>Answer</w:t>
-      </w:r>
-    </w:p>
-    <w:p>
-      <w:pPr/>
       <w:r>
         <w:t>Replay/duplication risk is partly mitigated by idempotency and dedupe, but residual race windows remain (severity: Medium).</w:t>
       </w:r>
@@ -1906,15 +1426,6 @@
       </w:r>
     </w:p>
     <w:p>
-      <w:pPr>
-        <w:pStyle w:val="AnswerLabel"/>
-      </w:pPr>
-      <w:r>
-        <w:t>Answer</w:t>
-      </w:r>
-    </w:p>
-    <w:p>
-      <w:pPr/>
       <w:r>
         <w:t>Deterministic vs AI divergence can cause human mis-triage unless runbooks explicitly prioritize deterministic signals (severity: Informational).</w:t>
       </w:r>
@@ -1936,15 +1447,6 @@
       </w:r>
     </w:p>
     <w:p>
-      <w:pPr>
-        <w:pStyle w:val="AnswerLabel"/>
-      </w:pPr>
-      <w:r>
-        <w:t>Answer</w:t>
-      </w:r>
-    </w:p>
-    <w:p>
-      <w:pPr/>
       <w:r>
         <w:t>CRE should not fully replace keeper logic immediately; near-term safest model is CRE supervision/policy + constrained deterministic execution.</w:t>
       </w:r>
@@ -1958,15 +1460,6 @@
       </w:r>
     </w:p>
     <w:p>
-      <w:pPr>
-        <w:pStyle w:val="AnswerLabel"/>
-      </w:pPr>
-      <w:r>
-        <w:t>Answer</w:t>
-      </w:r>
-    </w:p>
-    <w:p>
-      <w:pPr/>
       <w:r>
         <w:t>Good CRE candidates: scheduling, monitoring, deterministic policy checks, queueing, checkpointing, and alerting.</w:t>
       </w:r>
@@ -1980,15 +1473,6 @@
       </w:r>
     </w:p>
     <w:p>
-      <w:pPr>
-        <w:pStyle w:val="AnswerLabel"/>
-      </w:pPr>
-      <w:r>
-        <w:t>Answer</w:t>
-      </w:r>
-    </w:p>
-    <w:p>
-      <w:pPr/>
       <w:r>
         <w:t>Responsibilities that must stay deterministic/minimal include auth checks, action construction, idempotency, allowlists, and owner verification.</w:t>
       </w:r>
@@ -2002,15 +1486,6 @@
       </w:r>
     </w:p>
     <w:p>
-      <w:pPr>
-        <w:pStyle w:val="AnswerLabel"/>
-      </w:pPr>
-      <w:r>
-        <w:t>Answer</w:t>
-      </w:r>
-    </w:p>
-    <w:p>
-      <w:pPr/>
       <w:r>
         <w:t>Never rely on AI for write authorization, safety gating, liquidation-sensitive actions, or emergency mutation decisions.</w:t>
       </w:r>
@@ -2064,15 +1539,6 @@
       </w:r>
     </w:p>
     <w:p>
-      <w:pPr>
-        <w:pStyle w:val="AnswerLabel"/>
-      </w:pPr>
-      <w:r>
-        <w:t>Answer</w:t>
-      </w:r>
-    </w:p>
-    <w:p>
-      <w:pPr/>
       <w:r>
         <w:t>Use CRE as scheduler + monitor + deterministic policy engine + constrained transaction orchestrator + human escalation layer.</w:t>
       </w:r>
@@ -2118,15 +1584,6 @@
       </w:r>
     </w:p>
     <w:p>
-      <w:pPr>
-        <w:pStyle w:val="AnswerLabel"/>
-      </w:pPr>
-      <w:r>
-        <w:t>Answer</w:t>
-      </w:r>
-    </w:p>
-    <w:p>
-      <w:pPr/>
       <w:r>
         <w:t>In current Converge workflows, runtime/queue/idempotency pieces are reusable; bridge-heavy and prototype native-write paths need production hardening.</w:t>
       </w:r>
@@ -2180,15 +1637,6 @@
       </w:r>
     </w:p>
     <w:p>
-      <w:pPr>
-        <w:pStyle w:val="AnswerLabel"/>
-      </w:pPr>
-      <w:r>
-        <w:t>Answer</w:t>
-      </w:r>
-    </w:p>
-    <w:p>
-      <w:pPr/>
       <w:r>
         <w:t>CRE adds meaningful determinism, observability, replay protection, and checkpointing, but also introduces additional operational complexity.</w:t>
       </w:r>
@@ -2266,15 +1714,6 @@
       </w:r>
     </w:p>
     <w:p>
-      <w:pPr>
-        <w:pStyle w:val="AnswerLabel"/>
-      </w:pPr>
-      <w:r>
-        <w:t>Answer</w:t>
-      </w:r>
-    </w:p>
-    <w:p>
-      <w:pPr/>
       <w:r>
         <w:t>Key CRE risks: workflow misconfig, secret handling, trigger duplication, HTTP bridge dependency, persistence mismatch, unsafe authority delegation, and platform maturity concerns.</w:t>
       </w:r>
@@ -2312,15 +1751,6 @@
       </w:r>
     </w:p>
     <w:p>
-      <w:pPr>
-        <w:pStyle w:val="AnswerLabel"/>
-      </w:pPr>
-      <w:r>
-        <w:t>Answer</w:t>
-      </w:r>
-    </w:p>
-    <w:p>
-      <w:pPr/>
       <w:r>
         <w:t>Simulation provides strong pre-deploy confidence but is not identical to DON production behavior; institutional resilience still depends on hardened operations.</w:t>
       </w:r>
@@ -2342,15 +1772,6 @@
       </w:r>
     </w:p>
     <w:p>
-      <w:pPr>
-        <w:pStyle w:val="AnswerLabel"/>
-      </w:pPr>
-      <w:r>
-        <w:t>Answer</w:t>
-      </w:r>
-    </w:p>
-    <w:p>
-      <w:pPr/>
       <w:r>
         <w:t>At 20/35/50% collateral shocks, boundary regimes shift quickly; liveness pressure rises and higher-shock scenarios can realize impairment (severity: High/Critical).</w:t>
       </w:r>
@@ -2364,15 +1785,6 @@
       </w:r>
     </w:p>
     <w:p>
-      <w:pPr>
-        <w:pStyle w:val="AnswerLabel"/>
-      </w:pPr>
-      <w:r>
-        <w:t>Answer</w:t>
-      </w:r>
-    </w:p>
-    <w:p>
-      <w:pPr/>
       <w:r>
         <w:t>Rapid deleveraging makes target buckets stale quickly and increases fairness/yield degradation risk (severity: High).</w:t>
       </w:r>
@@ -2386,15 +1798,6 @@
       </w:r>
     </w:p>
     <w:p>
-      <w:pPr>
-        <w:pStyle w:val="AnswerLabel"/>
-      </w:pPr>
-      <w:r>
-        <w:t>Answer</w:t>
-      </w:r>
-    </w:p>
-    <w:p>
-      <w:pPr/>
       <w:r>
         <w:t>Active liquidation auctions increase abort/refill delay probability and can degrade exit liveness (severity: High).</w:t>
       </w:r>
@@ -2408,15 +1811,6 @@
       </w:r>
     </w:p>
     <w:p>
-      <w:pPr>
-        <w:pStyle w:val="AnswerLabel"/>
-      </w:pPr>
-      <w:r>
-        <w:t>Answer</w:t>
-      </w:r>
-    </w:p>
-    <w:p>
-      <w:pPr/>
       <w:r>
         <w:t>Bad debt emergence can lock system into prolonged no-rebalance states with severe liveness/economic impact (severity: Critical).</w:t>
       </w:r>
@@ -2430,15 +1824,6 @@
       </w:r>
     </w:p>
     <w:p>
-      <w:pPr>
-        <w:pStyle w:val="AnswerLabel"/>
-      </w:pPr>
-      <w:r>
-        <w:t>Answer</w:t>
-      </w:r>
-    </w:p>
-    <w:p>
-      <w:pPr/>
       <w:r>
         <w:t>If 25/50/80% TVL tries to redeem pre-rebalance, buffer exhaustion creates revert windows and first-exit advantage (severity: High/Critical).</w:t>
       </w:r>
@@ -2452,15 +1837,6 @@
       </w:r>
     </w:p>
     <w:p>
-      <w:pPr>
-        <w:pStyle w:val="AnswerLabel"/>
-      </w:pPr>
-      <w:r>
-        <w:t>Answer</w:t>
-      </w:r>
-    </w:p>
-    <w:p>
-      <w:pPr/>
       <w:r>
         <w:t>Stale oracle or bad price selection can repeatedly misallocate liquidity and realize yield loss (severity: High).</w:t>
       </w:r>
@@ -2474,15 +1850,6 @@
       </w:r>
     </w:p>
     <w:p>
-      <w:pPr>
-        <w:pStyle w:val="AnswerLabel"/>
-      </w:pPr>
-      <w:r>
-        <w:t>Answer</w:t>
-      </w:r>
-    </w:p>
-    <w:p>
-      <w:pPr/>
       <w:r>
         <w:t>Keeper offline for 12h/24h/72h progressively increases liveness and economic risk, with 72h potentially severe (severity: Medium/High/Critical).</w:t>
       </w:r>
@@ -2496,15 +1863,6 @@
       </w:r>
     </w:p>
     <w:p>
-      <w:pPr>
-        <w:pStyle w:val="AnswerLabel"/>
-      </w:pPr>
-      <w:r>
-        <w:t>Answer</w:t>
-      </w:r>
-    </w:p>
-    <w:p>
-      <w:pPr/>
       <w:r>
         <w:t>Subgraph failure can remove bad-debt visibility; fail-open configurations materially increase risk (severity: Medium/High).</w:t>
       </w:r>
@@ -2518,15 +1876,6 @@
       </w:r>
     </w:p>
     <w:p>
-      <w:pPr>
-        <w:pStyle w:val="AnswerLabel"/>
-      </w:pPr>
-      <w:r>
-        <w:t>Answer</w:t>
-      </w:r>
-    </w:p>
-    <w:p>
-      <w:pPr/>
       <w:r>
         <w:t>Admin mistakes in config or role control can create immediate broad safety failures (severity: High).</w:t>
       </w:r>
@@ -2540,15 +1889,6 @@
       </w:r>
     </w:p>
     <w:p>
-      <w:pPr>
-        <w:pStyle w:val="AnswerLabel"/>
-      </w:pPr>
-      <w:r>
-        <w:t>Answer</w:t>
-      </w:r>
-    </w:p>
-    <w:p>
-      <w:pPr/>
       <w:r>
         <w:t>CRE workflow outage mainly harms liveness through missed windows and queue backlog (severity: Medium).</w:t>
       </w:r>
@@ -2562,15 +1902,6 @@
       </w:r>
     </w:p>
     <w:p>
-      <w:pPr>
-        <w:pStyle w:val="AnswerLabel"/>
-      </w:pPr>
-      <w:r>
-        <w:t>Answer</w:t>
-      </w:r>
-    </w:p>
-    <w:p>
-      <w:pPr/>
       <w:r>
         <w:t>CRE duplicated trigger usually gets deduped, but residual races/retry churn remain possible (severity: Medium).</w:t>
       </w:r>
@@ -2584,15 +1915,6 @@
       </w:r>
     </w:p>
     <w:p>
-      <w:pPr>
-        <w:pStyle w:val="AnswerLabel"/>
-      </w:pPr>
-      <w:r>
-        <w:t>Answer</w:t>
-      </w:r>
-    </w:p>
-    <w:p>
-      <w:pPr/>
       <w:r>
         <w:t>If AI advisory returns nonsense while deterministic checks still pass, users mostly see misleading alerts and recommendations rather than unsafe automated state changes.</w:t>
       </w:r>
@@ -14705,20 +14027,6 @@
         <w:shd w:val="clear" w:color="auto" w:fill="FBCAA2" w:themeFill="accent6" w:themeFillTint="7F"/>
       </w:tcPr>
     </w:tblStylePr>
-  </w:style>
-  <w:style w:type="paragraph" w:customStyle="1" w:styleId="AnswerLabel">
-    <w:name w:val="Answer Label"/>
-    <w:basedOn w:val="Normal"/>
-    <w:pPr>
-      <w:spacing w:before="120" w:after="60"/>
-    </w:pPr>
-    <w:rPr>
-      <w:rFonts w:ascii="Cambria" w:hAnsi="Cambria"/>
-      <w:b/>
-      <w:i/>
-      <w:color w:val="424242"/>
-      <w:sz w:val="21"/>
-    </w:rPr>
   </w:style>
 </w:styles>
 </file>

</xml_diff>